<commit_message>
Buch 6: Bonus-QR-Code mit Petras Tentary-Link ins Manuskript eingefügt
Platzhalter ("wird es dazu bald ein kostenloses Bonus-PDF geben")
ersetzt durch den vollständigen Block wie bei den anderen Büchern:
Überschrift, kurze Einleitung, QR-Code, Link, Newsletter-Hinweis,
Signatur. Link: beyondlimitsnow25.mytentary.com/p/1DKSI4. Taschenbuch
und eBook neu gebaut (110 statt 109 Seiten), Cover-Rücken entsprechend
neu berechnet. eBook verlinkt den Link zusätzlich klickbar.

Co-Authored-By: Claude Sonnet 5 <noreply@anthropic.com>
Claude-Session: https://claude.ai/code/session_011oFtWvyjvkDdc6K2GcSXHx
</commit_message>
<xml_diff>
--- a/outputs/buch-letztes-gespraech/buch-MANUSKRIPT.docx
+++ b/outputs/buch-letztes-gespraech/buch-MANUSKRIPT.docx
@@ -5483,12 +5483,108 @@
       </w:r>
     </w:p>
     <w:p>
-      <w:r>
-        <w:rPr>
-          <w:b w:val="0"/>
-          <w:i w:val="0"/>
-        </w:rPr>
-        <w:t>Als kleines Dankeschön fürs Lesen wird es dazu bald ein kostenloses Bonus-PDF geben. Schreib mir gerne an info.safetothrive@gmail.com, was sich bei dir seit dem Buch verändert hat. Ich lese jede Nachricht.</w:t>
+      <w:r/>
+      <w:r>
+        <w:rPr>
+          <w:b/>
+          <w:sz w:val="28"/>
+        </w:rPr>
+        <w:t>Dein kostenloser Bonus zum Buch</w:t>
+      </w:r>
+    </w:p>
+    <w:p>
+      <w:r>
+        <w:rPr>
+          <w:b w:val="0"/>
+        </w:rPr>
+        <w:t>Du kennst dieses Gefühl: Das Gespräch, das nie stattgefunden hat, läuft trotzdem weiter, immer wieder, in deinem Kopf.</w:t>
+      </w:r>
+    </w:p>
+    <w:p>
+      <w:r>
+        <w:rPr>
+          <w:b w:val="0"/>
+        </w:rPr>
+        <w:t>Das kostenlose Begleit-PDF hilft dir, mit sechs kurzen Übungen aus dem Buch weiterzuarbeiten, für die Zeit, in der der erste Schwung nachlässt und die eigentliche Arbeit beginnt.</w:t>
+      </w:r>
+    </w:p>
+    <w:p>
+      <w:r>
+        <w:rPr>
+          <w:b w:val="0"/>
+        </w:rPr>
+        <w:t>Du musst nicht warten, bis du dich bereit fühlst, um damit anzufangen.</w:t>
+      </w:r>
+    </w:p>
+    <w:p>
+      <w:r>
+        <w:rPr>
+          <w:b w:val="0"/>
+        </w:rPr>
+        <w:t>Scanne den QR-Code oder öffne den folgenden Link:</w:t>
+      </w:r>
+    </w:p>
+    <w:p>
+      <w:pPr>
+        <w:jc w:val="center"/>
+      </w:pPr>
+      <w:r>
+        <w:drawing>
+          <wp:inline xmlns:a="http://schemas.openxmlformats.org/drawingml/2006/main" xmlns:pic="http://schemas.openxmlformats.org/drawingml/2006/picture">
+            <wp:extent cx="1620000" cy="1620000"/>
+            <wp:docPr id="1" name="Picture 1"/>
+            <wp:cNvGraphicFramePr>
+              <a:graphicFrameLocks noChangeAspect="1"/>
+            </wp:cNvGraphicFramePr>
+            <a:graphic>
+              <a:graphicData uri="http://schemas.openxmlformats.org/drawingml/2006/picture">
+                <pic:pic>
+                  <pic:nvPicPr>
+                    <pic:cNvPr id="0" name="buch-letztes-gespraech-qr-freebie.png"/>
+                    <pic:cNvPicPr/>
+                  </pic:nvPicPr>
+                  <pic:blipFill>
+                    <a:blip r:embed="rId9"/>
+                    <a:stretch>
+                      <a:fillRect/>
+                    </a:stretch>
+                  </pic:blipFill>
+                  <pic:spPr>
+                    <a:xfrm>
+                      <a:off x="0" y="0"/>
+                      <a:ext cx="1620000" cy="1620000"/>
+                    </a:xfrm>
+                    <a:prstGeom prst="rect"/>
+                  </pic:spPr>
+                </pic:pic>
+              </a:graphicData>
+            </a:graphic>
+          </wp:inline>
+        </w:drawing>
+      </w:r>
+    </w:p>
+    <w:p>
+      <w:r>
+        <w:t>https://beyondlimitsnow25.mytentary.com/p/1DKSI4</w:t>
+      </w:r>
+    </w:p>
+    <w:p>
+      <w:r>
+        <w:t>Mit der Anmeldung erhältst du auch E-Mails von Petra Tanner mit Impulsen und Neuigkeiten zu ihren Büchern. Eine Abmeldung ist jederzeit möglich.</w:t>
+      </w:r>
+    </w:p>
+    <w:p/>
+    <w:p>
+      <w:r>
+        <w:rPr>
+          <w:b/>
+        </w:rPr>
+        <w:t>Petra Tanner</w:t>
+      </w:r>
+    </w:p>
+    <w:p>
+      <w:r>
+        <w:t>Autorin und Mentorin</w:t>
       </w:r>
     </w:p>
     <w:p>

</xml_diff>

<commit_message>
Du brauchst kein letztes Gespräch: konkrete 24-Stunden-Handlung in sieben Übungen ergänzt
Gute Idee aus einem geprüften, sonst unbrauchbaren ChatGPT-Entwurf uebernommen
(unvollstaendig, fehlende Pflichtteile, eigene Wiederholung - nicht verwendet),
aber ohne dessen Fehler: dort stand sechsmal derselbe Satz, hier ist jede
Ergaenzung eigens zur jeweiligen Uebung formuliert.

Betrifft: Gespraechs-Uhr, Die Uebersetzung, Die Beweisfrage, Realitaets-
Anker, Verantwortungs-Liste, unversendeter Brief, Ghosting-Uebung. Jeweils
1-2 Saetze: konkrete Handlung fuer die naechsten 24 Stunden plus einfache
Ueberpruefung am naechsten Tag. Bestehender Uebungstext unveraendert.

buch-pruefen.py: keine neuen Befunde. Seiten 99 -> 99 (unveraendert).

Co-Authored-By: Claude Sonnet 5 <noreply@anthropic.com>
Claude-Session: https://claude.ai/code/session_011oFtWvyjvkDdc6K2GcSXHx
</commit_message>
<xml_diff>
--- a/outputs/buch-letztes-gespraech/buch-MANUSKRIPT.docx
+++ b/outputs/buch-letztes-gespraech/buch-MANUSKRIPT.docx
@@ -936,6 +936,15 @@
     <w:p>
       <w:r>
         <w:rPr>
+          <w:b w:val="0"/>
+          <w:i w:val="0"/>
+        </w:rPr>
+        <w:t xml:space="preserve">Leg dir für die nächsten 24 Stunden ein Blatt bereit und mach einen Strich, sobald das innere Gespräch anfängt. Zähl die Striche morgen nach, ganz ohne zu werten.</w:t>
+      </w:r>
+    </w:p>
+    <w:p>
+      <w:r>
+        <w:rPr>
           <w:b/>
         </w:rPr>
         <w:t>Zum Weiterdenken</w:t>
@@ -1054,6 +1063,15 @@
       </w:r>
     </w:p>
     <w:p>
+      <w:r>
+        <w:rPr>
+          <w:b w:val="0"/>
+          <w:i w:val="0"/>
+        </w:rPr>
+        <w:t xml:space="preserve">Sprich den übersetzten Satz heute einmal laut aus, nur für dich allein. Am nächsten Tag liest du ihn noch einmal und schaust, ob er immer noch stimmt.</w:t>
+      </w:r>
+    </w:p>
+    <w:p>
       <w:pPr>
         <w:jc w:val="center"/>
       </w:pPr>
@@ -1242,6 +1260,15 @@
       </w:r>
     </w:p>
     <w:p>
+      <w:r>
+        <w:rPr>
+          <w:b w:val="0"/>
+          <w:i w:val="0"/>
+        </w:rPr>
+        <w:t xml:space="preserve">Achte in den nächsten 24 Stunden bewusst darauf, ob genau dieses Verhalten irgendwo auftaucht, bei dieser Person oder in deiner Erinnerung daran. Halt am nächsten Tag in einem Satz fest, ob es so war.</w:t>
+      </w:r>
+    </w:p>
+    <w:p>
       <w:pPr>
         <w:jc w:val="center"/>
       </w:pPr>
@@ -1515,6 +1542,15 @@
       </w:r>
     </w:p>
     <w:p>
+      <w:r>
+        <w:rPr>
+          <w:b w:val="0"/>
+          <w:i w:val="0"/>
+        </w:rPr>
+        <w:t xml:space="preserve">Leg das Blatt heute an einen festen Ort, den du genau kennst, eine bestimmte Schublade oder Mappe. Am nächsten Tag schaust du nach, ob du es auf Anhieb wiederfindest.</w:t>
+      </w:r>
+    </w:p>
+    <w:p>
       <w:pPr>
         <w:jc w:val="center"/>
       </w:pPr>
@@ -1694,6 +1730,15 @@
       </w:r>
     </w:p>
     <w:p>
+      <w:r>
+        <w:rPr>
+          <w:b w:val="0"/>
+          <w:i w:val="0"/>
+        </w:rPr>
+        <w:t xml:space="preserve">Lies dir heute einen Satz aus der Spalte „Seine/ihre Verantwortung“ laut vor, auch wenn niemand im Raum ist. Morgen notierst du in einem Wort, wie sich das angefühlt hat.</w:t>
+      </w:r>
+    </w:p>
+    <w:p>
       <w:pPr>
         <w:jc w:val="center"/>
       </w:pPr>
@@ -1873,6 +1918,15 @@
       </w:r>
     </w:p>
     <w:p>
+      <w:r>
+        <w:rPr>
+          <w:b w:val="0"/>
+          <w:i w:val="0"/>
+        </w:rPr>
+        <w:t xml:space="preserve">Triff die Entscheidung über das Papier noch heute und setz sie auch um, verbrennen, aufbewahren oder wegwerfen. Am nächsten Tag schaust du nach, ob du es wirklich getan hast.</w:t>
+      </w:r>
+    </w:p>
+    <w:p>
       <w:pPr>
         <w:jc w:val="center"/>
       </w:pPr>
@@ -2378,6 +2432,15 @@
           <w:i w:val="0"/>
         </w:rPr>
         <w:t>Schreib die wahrscheinlichste, freundlichste UND die wahrscheinlichste, unfreundlichste Erklärung für das Schweigen auf. Meistens liegt die Wahrheit näher an der zweiten, als das eigene Ego zugeben möchte.</w:t>
+      </w:r>
+    </w:p>
+    <w:p>
+      <w:r>
+        <w:rPr>
+          <w:b w:val="0"/>
+          <w:i w:val="0"/>
+        </w:rPr>
+        <w:t xml:space="preserve">Schick dir die unfreundlichste Erklärung noch heute als Nachricht an dich selbst. Morgen liest du sie durch und prüfst, ob du sie immer noch für die wahrscheinlichere hältst.</w:t>
       </w:r>
     </w:p>
     <w:p>

</xml_diff>